<commit_message>
feat(tiktok): update built-in proof material template
</commit_message>
<xml_diff>
--- a/src/TikTokPublisher/TikTokPublisher.Core/Resources/权力声明模板.docx
+++ b/src/TikTokPublisher/TikTokPublisher.Core/Resources/权力声明模板.docx
@@ -220,22 +220,7 @@
           <w:szCs w:val="28"/>
           <w:lang w:val="en-US" w:eastAsia="zh-CN" w:bidi="ar"/>
         </w:rPr>
-        <w:t>短剧承制合</w:t>
-      </w:r>
-      <w:bookmarkStart w:id="0" w:name="_GoBack"/>
-      <w:bookmarkEnd w:id="0"/>
-      <w:r>
-        <w:rPr>
-          <w:rFonts w:hint="eastAsia" w:ascii="宋体" w:hAnsi="宋体" w:eastAsia="宋体" w:cs="宋体"/>
-          <w:b/>
-          <w:bCs/>
-          <w:color w:val="000000"/>
-          <w:kern w:val="0"/>
-          <w:sz w:val="28"/>
-          <w:szCs w:val="28"/>
-          <w:lang w:val="en-US" w:eastAsia="zh-CN" w:bidi="ar"/>
-        </w:rPr>
-        <w:t>同</w:t>
+        <w:t>短剧承制合同</w:t>
       </w:r>
       <w:r>
         <w:rPr>
@@ -429,15 +414,15 @@
           <wp:anchor distT="0" distB="0" distL="114300" distR="114300" simplePos="0" relativeHeight="251659264" behindDoc="0" locked="0" layoutInCell="1" allowOverlap="1">
             <wp:simplePos x="0" y="0"/>
             <wp:positionH relativeFrom="column">
-              <wp:posOffset>3157855</wp:posOffset>
+              <wp:posOffset>3557905</wp:posOffset>
             </wp:positionH>
             <wp:positionV relativeFrom="paragraph">
-              <wp:posOffset>71120</wp:posOffset>
+              <wp:posOffset>80645</wp:posOffset>
             </wp:positionV>
-            <wp:extent cx="1746885" cy="1684020"/>
-            <wp:effectExtent l="0" t="0" r="24765" b="46990"/>
+            <wp:extent cx="1746885" cy="1722120"/>
+            <wp:effectExtent l="0" t="0" r="5715" b="11430"/>
             <wp:wrapNone/>
-            <wp:docPr id="1" name="图片 1" descr="ff03ad753662d1be51aa6e82c4b65420_副本"/>
+            <wp:docPr id="1" name="图片 1" descr="C:/Users/PC/Desktop/zhangbiao/word/湖北星跃宸科技有限公司/seal.pngseal"/>
             <wp:cNvGraphicFramePr>
               <a:graphicFrameLocks xmlns:a="http://schemas.openxmlformats.org/drawingml/2006/main" noChangeAspect="1"/>
             </wp:cNvGraphicFramePr>
@@ -445,21 +430,22 @@
               <a:graphicData uri="http://schemas.openxmlformats.org/drawingml/2006/picture">
                 <pic:pic xmlns:pic="http://schemas.openxmlformats.org/drawingml/2006/picture">
                   <pic:nvPicPr>
-                    <pic:cNvPr id="1" name="图片 1" descr="ff03ad753662d1be51aa6e82c4b65420_副本"/>
+                    <pic:cNvPr id="1" name="图片 1" descr="C:/Users/PC/Desktop/zhangbiao/word/湖北星跃宸科技有限公司/seal.pngseal"/>
                     <pic:cNvPicPr>
                       <a:picLocks noChangeAspect="1"/>
                     </pic:cNvPicPr>
                   </pic:nvPicPr>
                   <pic:blipFill>
                     <a:blip r:embed="rId4"/>
+                    <a:srcRect t="1545" b="1545"/>
                     <a:stretch>
                       <a:fillRect/>
                     </a:stretch>
                   </pic:blipFill>
                   <pic:spPr>
-                    <a:xfrm rot="11040000">
+                    <a:xfrm rot="10800000">
                       <a:off x="0" y="0"/>
-                      <a:ext cx="1746885" cy="1684020"/>
+                      <a:ext cx="1746885" cy="1722120"/>
                     </a:xfrm>
                     <a:prstGeom prst="rect">
                       <a:avLst/>
@@ -537,6 +523,8 @@
           <w:lang w:val="en-US" w:eastAsia="zh-CN" w:bidi="ar"/>
         </w:rPr>
       </w:pPr>
+      <w:bookmarkStart w:id="0" w:name="_GoBack"/>
+      <w:bookmarkEnd w:id="0"/>
     </w:p>
     <w:p>
       <w:pPr>

</xml_diff>

<commit_message>
chore(proof): update built-in declaration template
</commit_message>
<xml_diff>
--- a/src/TikTokPublisher/TikTokPublisher.Core/Resources/权力声明模板.docx
+++ b/src/TikTokPublisher/TikTokPublisher.Core/Resources/权力声明模板.docx
@@ -420,9 +420,9 @@
               <wp:posOffset>80645</wp:posOffset>
             </wp:positionV>
             <wp:extent cx="1746885" cy="1722120"/>
-            <wp:effectExtent l="0" t="0" r="5715" b="11430"/>
+            <wp:effectExtent l="0" t="0" r="0" b="11430"/>
             <wp:wrapNone/>
-            <wp:docPr id="1" name="图片 1" descr="C:/Users/PC/Desktop/zhangbiao/word/湖北星跃宸科技有限公司/seal.pngseal"/>
+            <wp:docPr id="1" name="图片 1" descr="C:/Users/PC/Desktop/zhangbiao/word/武汉速视/seal.pngseal"/>
             <wp:cNvGraphicFramePr>
               <a:graphicFrameLocks xmlns:a="http://schemas.openxmlformats.org/drawingml/2006/main" noChangeAspect="1"/>
             </wp:cNvGraphicFramePr>
@@ -430,14 +430,14 @@
               <a:graphicData uri="http://schemas.openxmlformats.org/drawingml/2006/picture">
                 <pic:pic xmlns:pic="http://schemas.openxmlformats.org/drawingml/2006/picture">
                   <pic:nvPicPr>
-                    <pic:cNvPr id="1" name="图片 1" descr="C:/Users/PC/Desktop/zhangbiao/word/湖北星跃宸科技有限公司/seal.pngseal"/>
+                    <pic:cNvPr id="1" name="图片 1" descr="C:/Users/PC/Desktop/zhangbiao/word/武汉速视/seal.pngseal"/>
                     <pic:cNvPicPr>
                       <a:picLocks noChangeAspect="1"/>
                     </pic:cNvPicPr>
                   </pic:nvPicPr>
                   <pic:blipFill>
                     <a:blip r:embed="rId4"/>
-                    <a:srcRect t="1545" b="1545"/>
+                    <a:srcRect t="745" b="745"/>
                     <a:stretch>
                       <a:fillRect/>
                     </a:stretch>
@@ -523,8 +523,6 @@
           <w:lang w:val="en-US" w:eastAsia="zh-CN" w:bidi="ar"/>
         </w:rPr>
       </w:pPr>
-      <w:bookmarkStart w:id="0" w:name="_GoBack"/>
-      <w:bookmarkEnd w:id="0"/>
     </w:p>
     <w:p>
       <w:pPr>
@@ -552,6 +550,8 @@
           <w:lang w:val="en-US" w:eastAsia="zh-CN" w:bidi="ar"/>
         </w:rPr>
       </w:pPr>
+      <w:bookmarkStart w:id="0" w:name="_GoBack"/>
+      <w:bookmarkEnd w:id="0"/>
       <w:r>
         <w:rPr>
           <w:rFonts w:ascii="宋体" w:hAnsi="宋体" w:eastAsia="宋体" w:cs="宋体"/>

</xml_diff>